<commit_message>
Docs: plain-language waiting-time section with the one-counter shortcut
</commit_message>
<xml_diff>
--- a/docs/documentation.docx
+++ b/docs/documentation.docx
@@ -955,10 +955,10 @@
                 <w:b/>
                 <w:bCs/>
               </w:rPr>
-              <w:t xml:space="preserve">Expected visit length</w:t>
-            </w:r>
-            <w:r>
-              <w:t xml:space="preserve"> (per service) = mean of the last 5 served visits (called → served), each clamped to 1 min … 3 × the default. Before any data exists, the default is used. No-shows and cancellations never count.</w:t>
+              <w:t xml:space="preserve">1. How long a visit takes.</w:t>
+            </w:r>
+            <w:r>
+              <w:t xml:space="preserve"> For each service, the average of its last 5 real visits. Until there are real visits, the default length is used. No-shows don't count, and one very long or very short visit is capped so it can't distort the average.</w:t>
             </w:r>
           </w:p>
           <w:p>
@@ -970,10 +970,10 @@
                 <w:b/>
                 <w:bCs/>
               </w:rPr>
-              <w:t xml:space="preserve">Each counter is free at</w:t>
-            </w:r>
-            <w:r>
-              <w:t xml:space="preserve"> now if idle, otherwise now + max(expected − elapsed, 1 min).</w:t>
+              <w:t xml:space="preserve">2. Play the queue forward.</w:t>
+            </w:r>
+            <w:r>
+              <w:t xml:space="preserve"> The system works out when the counter will next be free: now if nobody is with the doctor, otherwise when the current patient should finish (at least 1 minute away). At that moment it "calls" the next patient using the same rule as the Call next button, notes their start time, adds their visit length, and repeats down the list.</w:t>
             </w:r>
           </w:p>
           <w:p>
@@ -985,20 +985,20 @@
                 <w:b/>
                 <w:bCs/>
               </w:rPr>
-              <w:t xml:space="preserve">Forward simulation:</w:t>
-            </w:r>
-            <w:r>
-              <w:t xml:space="preserve"> repeatedly take the counter that frees up first (time t), apply the same call-next rule at t, start that patient at t, and mark the counter free again at t + expected. </w:t>
+              <w:t xml:space="preserve">3. The wait.</w:t>
+            </w:r>
+            <w:r>
+              <w:t xml:space="preserve"> Wait = predicted start time − now. With one counter (as in the live demo) this is simply: </w:t>
             </w:r>
             <w:r>
               <w:rPr>
                 <w:b/>
                 <w:bCs/>
               </w:rPr>
-              <w:t xml:space="preserve">Wait = start − now</w:t>
-            </w:r>
-            <w:r>
-              <w:t xml:space="preserve">; the patient's position is their order in this projection.</w:t>
+              <w:t xml:space="preserve">time left for the current patient + the visit lengths of everyone ahead.</w:t>
+            </w:r>
+            <w:r>
+              <w:t xml:space="preserve"> With more counters, each patient goes to whichever counter frees up first.</w:t>
             </w:r>
           </w:p>
           <w:p>
@@ -1010,10 +1010,10 @@
                 <w:b/>
                 <w:bCs/>
               </w:rPr>
-              <w:t xml:space="preserve">Shown as</w:t>
-            </w:r>
-            <w:r>
-              <w:t xml:space="preserve"> "Due now" when ≤ 2 min, otherwise "~X min" rounded up to the next 5. Recomputed after every action and every 3-second refresh.</w:t>
+              <w:t xml:space="preserve">4. How it's shown.</w:t>
+            </w:r>
+            <w:r>
+              <w:t xml:space="preserve"> "Due now" for 2 minutes or less; otherwise "~X min", rounded up to the next 5. Updated after every action and every 3 seconds.</w:t>
             </w:r>
           </w:p>
         </w:tc>

</xml_diff>

<commit_message>
README + docs: 'Before you start' note on Load sample day and Reset day, right after the live link
</commit_message>
<xml_diff>
--- a/docs/documentation.docx
+++ b/docs/documentation.docx
@@ -93,6 +93,62 @@
       </w:r>
       <w:r>
         <w:t xml:space="preserve"> https://github.com/zayannnn2000/Queue_Management_System</w:t>
+      </w:r>
+    </w:p>
+    <w:p>
+      <w:pPr>
+        <w:spacing w:after="80"/>
+      </w:pPr>
+      <w:r>
+        <w:rPr>
+          <w:b/>
+          <w:bCs/>
+        </w:rPr>
+        <w:t xml:space="preserve">Before you start:</w:t>
+      </w:r>
+      <w:r>
+        <w:t xml:space="preserve"> sign in with PIN </w:t>
+      </w:r>
+      <w:r>
+        <w:rPr>
+          <w:b/>
+          <w:bCs/>
+          <w:color w:val="7656A6"/>
+        </w:rPr>
+        <w:t xml:space="preserve">12345</w:t>
+      </w:r>
+      <w:r>
+        <w:t xml:space="preserve">, then open </w:t>
+      </w:r>
+      <w:r>
+        <w:rPr>
+          <w:b/>
+          <w:bCs/>
+        </w:rPr>
+        <w:t xml:space="preserve">Settings</w:t>
+      </w:r>
+      <w:r>
+        <w:t xml:space="preserve">. </w:t>
+      </w:r>
+      <w:r>
+        <w:rPr>
+          <w:b/>
+          <w:bCs/>
+        </w:rPr>
+        <w:t xml:space="preserve">Load sample day</w:t>
+      </w:r>
+      <w:r>
+        <w:t xml:space="preserve"> fills the queue with 10 fictional patients to try everything at once; </w:t>
+      </w:r>
+      <w:r>
+        <w:rPr>
+          <w:b/>
+          <w:bCs/>
+        </w:rPr>
+        <w:t xml:space="preserve">Reset day</w:t>
+      </w:r>
+      <w:r>
+        <w:t xml:space="preserve"> clears today's queue and restarts tokens at W-001 / A-001. The queue also clears itself at midnight (Dhaka time).</w:t>
       </w:r>
     </w:p>
     <w:p>

</xml_diff>

<commit_message>
README + docs: describe token features (issuing, printing, reprint, display, Find my token)
</commit_message>
<xml_diff>
--- a/docs/documentation.docx
+++ b/docs/documentation.docx
@@ -792,6 +792,119 @@
       </w:r>
       <w:r>
         <w:t xml:space="preserve"> for staff to check in, mark a no-show or cancel. Edits are allowed until a patient is called. For the last patient only Served and No-show are offered.</w:t>
+      </w:r>
+    </w:p>
+    <w:p>
+      <w:pPr>
+        <w:spacing w:after="20" w:before="60"/>
+      </w:pPr>
+      <w:r>
+        <w:rPr>
+          <w:b/>
+          <w:bCs/>
+        </w:rPr>
+        <w:t xml:space="preserve">Tokens.</w:t>
+      </w:r>
+    </w:p>
+    <w:p>
+      <w:pPr>
+        <w:pStyle w:val="ListParagraph"/>
+        <w:numPr>
+          <w:ilvl w:val="0"/>
+          <w:numId w:val="2"/>
+        </w:numPr>
+        <w:spacing w:after="40"/>
+      </w:pPr>
+      <w:r>
+        <w:rPr>
+          <w:b/>
+          <w:bCs/>
+        </w:rPr>
+        <w:t xml:space="preserve">Issued:</w:t>
+      </w:r>
+      <w:r>
+        <w:t xml:space="preserve"> a W-token when a walk-in is added; an A-token when an appointment is booked (it joins the queue only at check-in). Tokens never change, even when edited or late.</w:t>
+      </w:r>
+    </w:p>
+    <w:p>
+      <w:pPr>
+        <w:pStyle w:val="ListParagraph"/>
+        <w:numPr>
+          <w:ilvl w:val="0"/>
+          <w:numId w:val="2"/>
+        </w:numPr>
+        <w:spacing w:after="40"/>
+      </w:pPr>
+      <w:r>
+        <w:rPr>
+          <w:b/>
+          <w:bCs/>
+        </w:rPr>
+        <w:t xml:space="preserve">Printed:</w:t>
+      </w:r>
+      <w:r>
+        <w:t xml:space="preserve"> after Add walk-in or Check in, </w:t>
+      </w:r>
+      <w:r>
+        <w:rPr>
+          <w:b/>
+          <w:bCs/>
+        </w:rPr>
+        <w:t xml:space="preserve">Print token</w:t>
+      </w:r>
+      <w:r>
+        <w:t xml:space="preserve"> prints an 80 mm slip with the token, booking, service, place, estimated wait, time issued and the display link, but no name. Waiting rows have </w:t>
+      </w:r>
+      <w:r>
+        <w:rPr>
+          <w:b/>
+          <w:bCs/>
+        </w:rPr>
+        <w:t xml:space="preserve">Print</w:t>
+      </w:r>
+      <w:r>
+        <w:t xml:space="preserve"> for reprints.</w:t>
+      </w:r>
+    </w:p>
+    <w:p>
+      <w:pPr>
+        <w:pStyle w:val="ListParagraph"/>
+        <w:numPr>
+          <w:ilvl w:val="0"/>
+          <w:numId w:val="2"/>
+        </w:numPr>
+        <w:spacing w:after="40"/>
+      </w:pPr>
+      <w:r>
+        <w:rPr>
+          <w:b/>
+          <w:bCs/>
+        </w:rPr>
+        <w:t xml:space="preserve">Followed:</w:t>
+      </w:r>
+      <w:r>
+        <w:t xml:space="preserve"> the display shows Now serving, the next two under Please get ready, and every waiting token with initial, place and wait. </w:t>
+      </w:r>
+      <w:r>
+        <w:rPr>
+          <w:b/>
+          <w:bCs/>
+          <w:color w:val="7656A6"/>
+        </w:rPr>
+        <w:t xml:space="preserve">?token=W-004</w:t>
+      </w:r>
+      <w:r>
+        <w:t xml:space="preserve"> or </w:t>
+      </w:r>
+      <w:r>
+        <w:rPr>
+          <w:b/>
+          <w:bCs/>
+        </w:rPr>
+        <w:t xml:space="preserve">Find my token</w:t>
+      </w:r>
+      <w:r>
+        <w:t xml:space="preserve"> highlights one row ("You are number 2 in line").</w:t>
       </w:r>
     </w:p>
     <w:tbl>

</xml_diff>

<commit_message>
Slip: QR code linking to the patient's place on the display; 80 x 160 mm page
</commit_message>
<xml_diff>
--- a/docs/documentation.docx
+++ b/docs/documentation.docx
@@ -853,7 +853,7 @@
         <w:t xml:space="preserve">Print token</w:t>
       </w:r>
       <w:r>
-        <w:t xml:space="preserve"> prints an 80 mm slip with the token, booking, service, place, estimated wait and time issued, but no name. Waiting rows have </w:t>
+        <w:t xml:space="preserve"> prints an 80 mm slip with the token, booking, service, place, estimated wait, time issued and a QR code that opens the patient's place on the display, but no name. Waiting rows have </w:t>
       </w:r>
       <w:r>
         <w:rPr>
@@ -3003,7 +3003,7 @@
               <w:t xml:space="preserve">Print token</w:t>
             </w:r>
             <w:r>
-              <w:t xml:space="preserve">.</w:t>
+              <w:t xml:space="preserve">, then scan the slip's QR code with a phone.</w:t>
             </w:r>
           </w:p>
         </w:tc>
@@ -3025,7 +3025,7 @@
           </w:tcPr>
           <w:p>
             <w:r>
-              <w:t xml:space="preserve">The print dialog shows a slip with W-001, Walk-in, the service, place and wait, and no name.</w:t>
+              <w:t xml:space="preserve">An 80 mm slip with W-001, Walk-in, the service, place, wait and a QR code, and no name. The QR opens the display with W-001 highlighted.</w:t>
             </w:r>
           </w:p>
         </w:tc>

</xml_diff>

<commit_message>
Docs: README, Word documentation, diagrams and AI log for per-service queues
- README: services and rooms, CW/CA tokens, the front desk layout, the per-service call-next
  rule with priority, protection and the 15-min walk-in hold, an 11-step test walkthrough.
- Diagrams redrawn: per-service workflow; call-next decision for one room.
- documentation.docx rebuilt (2 pages + appendices), with the new worked example.
- AI_USAGE_LOG sections 15-18.
</commit_message>
<xml_diff>
--- a/docs/documentation.docx
+++ b/docs/documentation.docx
@@ -138,7 +138,7 @@
         <w:t xml:space="preserve">Load sample day</w:t>
       </w:r>
       <w:r>
-        <w:t xml:space="preserve"> fills the queue with 10 fictional patients to try everything at once; </w:t>
+        <w:t xml:space="preserve"> fills the five service queues with fictional patients to try everything at once; </w:t>
       </w:r>
       <w:r>
         <w:rPr>
@@ -148,7 +148,7 @@
         <w:t xml:space="preserve">Reset day</w:t>
       </w:r>
       <w:r>
-        <w:t xml:space="preserve"> clears today's queue and restarts tokens at W-001 / A-001. The queue also clears itself at midnight (Dhaka time).</w:t>
+        <w:t xml:space="preserve"> clears today's queue and restarts every token sequence (CW-001, CA-001, BW-001 …). The queue also clears itself at midnight (Dhaka time).</w:t>
       </w:r>
     </w:p>
     <w:p>
@@ -188,10 +188,10 @@
           <w:b/>
           <w:bCs/>
         </w:rPr>
-        <w:t xml:space="preserve">One ordering key: the target time.</w:t>
-      </w:r>
-      <w:r>
-        <w:t xml:space="preserve"> Every waiting patient has one comparable time, so "fair and in order" and "appointments at their scheduled time" become a single rule instead of two competing queues.</w:t>
+        <w:t xml:space="preserve">One front desk, one queue per service.</w:t>
+      </w:r>
+      <w:r>
+        <w:t xml:space="preserve"> Consultation, follow-up, blood test, vaccination and prescription renewal each have their own queue and room(s), so a 5-minute blood test never waits behind 15-minute consultations. Services can be added or removed in Settings.</w:t>
       </w:r>
     </w:p>
     <w:p>
@@ -208,10 +208,10 @@
           <w:b/>
           <w:bCs/>
         </w:rPr>
-        <w:t xml:space="preserve">Appointments join the queue only at check-in.</w:t>
-      </w:r>
-      <w:r>
-        <w:t xml:space="preserve"> A booking that hasn't arrived can never hold up patients who are present.</w:t>
+        <w:t xml:space="preserve">One ordering key per queue: the target time.</w:t>
+      </w:r>
+      <w:r>
+        <w:t xml:space="preserve"> Every waiting patient has one comparable time, so "fair and in order" and "appointments at their scheduled time" become a single rule instead of competing lists.</w:t>
       </w:r>
     </w:p>
     <w:p>
@@ -228,21 +228,30 @@
           <w:b/>
           <w:bCs/>
         </w:rPr>
-        <w:t xml:space="preserve">All queue logic is one pure, tested module</w:t>
-      </w:r>
-      <w:r>
-        <w:t xml:space="preserve"> (</w:t>
-      </w:r>
-      <w:r>
-        <w:rPr>
-          <w:b/>
-          <w:bCs/>
-          <w:color w:val="7656A6"/>
-        </w:rPr>
-        <w:t xml:space="preserve">lib/queue.ts</w:t>
-      </w:r>
-      <w:r>
-        <w:t xml:space="preserve">): no I/O, and the clock is always passed in. Every staff action goes through a single reducer that the server runs, so the unit tests cover exactly the code the live app uses.</w:t>
+        <w:t xml:space="preserve">Appointments come first at their time,</w:t>
+      </w:r>
+      <w:r>
+        <w:t xml:space="preserve"> a walk-in arriving just before a booking is held 15 minutes, staff can flag </w:t>
+      </w:r>
+      <w:r>
+        <w:rPr>
+          <w:b/>
+          <w:bCs/>
+        </w:rPr>
+        <w:t xml:space="preserve">Priority</w:t>
+      </w:r>
+      <w:r>
+        <w:t xml:space="preserve"> (Elderly, Pregnant, Disability, Urgent, Other) or </w:t>
+      </w:r>
+      <w:r>
+        <w:rPr>
+          <w:b/>
+          <w:bCs/>
+        </w:rPr>
+        <w:t xml:space="preserve">Call now</w:t>
+      </w:r>
+      <w:r>
+        <w:t xml:space="preserve">, and a walk-in who has waited 30 minutes keeps their place.</w:t>
       </w:r>
     </w:p>
     <w:p>
@@ -259,10 +268,10 @@
           <w:b/>
           <w:bCs/>
         </w:rPr>
-        <w:t xml:space="preserve">The server decides who is next</w:t>
-      </w:r>
-      <w:r>
-        <w:t xml:space="preserve"> and writes with a compare-and-set on a version number, so two staff pressing "Call next" at the same moment can never call the same patient.</w:t>
+        <w:t xml:space="preserve">Appointments join the queue only at check-in.</w:t>
+      </w:r>
+      <w:r>
+        <w:t xml:space="preserve"> A booking that hasn't arrived can never hold up patients who are present.</w:t>
       </w:r>
     </w:p>
     <w:p>
@@ -279,10 +288,21 @@
           <w:b/>
           <w:bCs/>
         </w:rPr>
-        <w:t xml:space="preserve">The wait estimate replays the call-next rule</w:t>
-      </w:r>
-      <w:r>
-        <w:t xml:space="preserve"> instead of using a separate formula, so the estimate and the real order can't disagree.</w:t>
+        <w:t xml:space="preserve">All queue logic is one pure, tested module</w:t>
+      </w:r>
+      <w:r>
+        <w:t xml:space="preserve"> (</w:t>
+      </w:r>
+      <w:r>
+        <w:rPr>
+          <w:b/>
+          <w:bCs/>
+          <w:color w:val="7656A6"/>
+        </w:rPr>
+        <w:t xml:space="preserve">lib/queue.ts</w:t>
+      </w:r>
+      <w:r>
+        <w:t xml:space="preserve">): no I/O, and the clock is always passed in. Every staff action goes through a single reducer that the server runs, so the unit tests cover exactly the code the live app uses.</w:t>
       </w:r>
     </w:p>
     <w:p>
@@ -299,10 +319,10 @@
           <w:b/>
           <w:bCs/>
         </w:rPr>
-        <w:t xml:space="preserve">Every call is explained</w:t>
-      </w:r>
-      <w:r>
-        <w:t xml:space="preserve"> on screen, e.g. "A-003 called: appointment at 10:30, the earliest due target".</w:t>
+        <w:t xml:space="preserve">The server decides who is next</w:t>
+      </w:r>
+      <w:r>
+        <w:t xml:space="preserve"> and writes with a compare-and-set on a version number, so two staff pressing "Call next" at the same moment can never call the same patient.</w:t>
       </w:r>
     </w:p>
     <w:p>
@@ -319,10 +339,10 @@
           <w:b/>
           <w:bCs/>
         </w:rPr>
-        <w:t xml:space="preserve">Privacy by design.</w:t>
-      </w:r>
-      <w:r>
-        <w:t xml:space="preserve"> The public display and the printed token slip show only the token (and the first initial on the display); full names never leave the staff view. Only a name and a service are collected.</w:t>
+        <w:t xml:space="preserve">The wait estimate replays the call-next rule</w:t>
+      </w:r>
+      <w:r>
+        <w:t xml:space="preserve"> instead of using a separate formula, so the estimate and the real order can't disagree.</w:t>
       </w:r>
     </w:p>
     <w:p>
@@ -339,10 +359,10 @@
           <w:b/>
           <w:bCs/>
         </w:rPr>
-        <w:t xml:space="preserve">Staff access with one shared PIN:</w:t>
-      </w:r>
-      <w:r>
-        <w:t xml:space="preserve"> a signed 12-hour session cookie, a lock-out after 5 wrong tries, and checks in both the proxy and every staff API route. The waiting-room display stays public.</w:t>
+        <w:t xml:space="preserve">Every call is explained</w:t>
+      </w:r>
+      <w:r>
+        <w:t xml:space="preserve"> on screen, e.g. "CA-003 called: appointment at 10:30 is due, and appointments go ahead of walk-ins at their time".</w:t>
       </w:r>
     </w:p>
     <w:p>
@@ -359,18 +379,10 @@
           <w:b/>
           <w:bCs/>
         </w:rPr>
-        <w:t xml:space="preserve">Polling every 3 seconds</w:t>
-      </w:r>
-      <w:r>
-        <w:t xml:space="preserve"> instead of WebSockets: simple and robust on serverless hosting, at the cost of up to 3 seconds of delay.</w:t>
-      </w:r>
-    </w:p>
-    <w:p>
-      <w:pPr>
-        <w:pStyle w:val="Heading1"/>
-      </w:pPr>
-      <w:r>
-        <w:t xml:space="preserve">2. Assumptions</w:t>
+        <w:t xml:space="preserve">Privacy by design.</w:t>
+      </w:r>
+      <w:r>
+        <w:t xml:space="preserve"> The public display and the printed token slip show only the token (and the first initial on the display); full names never leave the staff view. Only a name and a service are collected.</w:t>
       </w:r>
     </w:p>
     <w:p>
@@ -383,29 +395,22 @@
         <w:spacing w:after="40"/>
       </w:pPr>
       <w:r>
-        <w:t xml:space="preserve">One clinic, timezone Asia/Dhaka. Tokens </w:t>
-      </w:r>
-      <w:r>
-        <w:rPr>
-          <w:b/>
-          <w:bCs/>
-          <w:color w:val="7656A6"/>
-        </w:rPr>
-        <w:t xml:space="preserve">W-001</w:t>
-      </w:r>
-      <w:r>
-        <w:t xml:space="preserve"> / </w:t>
-      </w:r>
-      <w:r>
-        <w:rPr>
-          <w:b/>
-          <w:bCs/>
-          <w:color w:val="7656A6"/>
-        </w:rPr>
-        <w:t xml:space="preserve">A-001</w:t>
-      </w:r>
-      <w:r>
-        <w:t xml:space="preserve"> restart each day.</w:t>
+        <w:rPr>
+          <w:b/>
+          <w:bCs/>
+        </w:rPr>
+        <w:t xml:space="preserve">Staff access with one shared PIN:</w:t>
+      </w:r>
+      <w:r>
+        <w:t xml:space="preserve"> a signed 12-hour session cookie, a lock-out after 5 wrong tries, and checks in both the proxy and every staff API route. The waiting-room display stays public.</w:t>
+      </w:r>
+    </w:p>
+    <w:p>
+      <w:pPr>
+        <w:pStyle w:val="Heading1"/>
+      </w:pPr>
+      <w:r>
+        <w:t xml:space="preserve">2. Assumptions</w:t>
       </w:r>
     </w:p>
     <w:p>
@@ -418,7 +423,29 @@
         <w:spacing w:after="40"/>
       </w:pPr>
       <w:r>
-        <w:t xml:space="preserve">1 counter by default (configurable 1–4); any counter serves any patient. Grace period 10 min (configurable).</w:t>
+        <w:t xml:space="preserve">One clinic, timezone Asia/Dhaka. Tokens are the service letter + W (walk-in) or A (appointment): </w:t>
+      </w:r>
+      <w:r>
+        <w:rPr>
+          <w:b/>
+          <w:bCs/>
+          <w:color w:val="7656A6"/>
+        </w:rPr>
+        <w:t xml:space="preserve">CW-004</w:t>
+      </w:r>
+      <w:r>
+        <w:t xml:space="preserve">, </w:t>
+      </w:r>
+      <w:r>
+        <w:rPr>
+          <w:b/>
+          <w:bCs/>
+          <w:color w:val="7656A6"/>
+        </w:rPr>
+        <w:t xml:space="preserve">BA-002</w:t>
+      </w:r>
+      <w:r>
+        <w:t xml:space="preserve">; each restarts daily.</w:t>
       </w:r>
     </w:p>
     <w:p>
@@ -431,7 +458,7 @@
         <w:spacing w:after="40"/>
       </w:pPr>
       <w:r>
-        <w:t xml:space="preserve">Default visit lengths: consultation 15, follow-up 10, blood test 5, vaccination 5, prescription renewal 5 min.</w:t>
+        <w:t xml:space="preserve">Five services, each with 1 room by default (1–4 configurable; up to 10 services). Grace period 10 min; walk-in protection 30 min (0 = off).</w:t>
       </w:r>
     </w:p>
     <w:p>
@@ -444,7 +471,30 @@
         <w:spacing w:after="40"/>
       </w:pPr>
       <w:r>
-        <w:t xml:space="preserve">Bookings are for today, in 5-minute slots, at or after the current time. No double-booking: overlapping appointments may not exceed the number of counters.</w:t>
+        <w:t xml:space="preserve">Default visit lengths: consultation 15, follow-up 10, blood test 5, vaccination 5, prescription renewal 5 min.</w:t>
+      </w:r>
+    </w:p>
+    <w:p>
+      <w:pPr>
+        <w:pStyle w:val="ListParagraph"/>
+        <w:numPr>
+          <w:ilvl w:val="0"/>
+          <w:numId w:val="2"/>
+        </w:numPr>
+        <w:spacing w:after="40"/>
+      </w:pPr>
+      <w:r>
+        <w:t xml:space="preserve">Bookings are for today, in 5-minute slots, at or after the current time. No double-booking </w:t>
+      </w:r>
+      <w:r>
+        <w:rPr>
+          <w:b/>
+          <w:bCs/>
+        </w:rPr>
+        <w:t xml:space="preserve">within a service</w:t>
+      </w:r>
+      <w:r>
+        <w:t xml:space="preserve">: its overlapping appointments may not exceed its rooms. Other services may share the time.</w:t>
       </w:r>
     </w:p>
     <w:p>
@@ -586,7 +636,17 @@
           </w:tcPr>
           <w:p>
             <w:r>
-              <w:t xml:space="preserve">Arrival time</w:t>
+              <w:t xml:space="preserve">Arrival time, or </w:t>
+            </w:r>
+            <w:r>
+              <w:rPr>
+                <w:b/>
+                <w:bCs/>
+              </w:rPr>
+              <w:t xml:space="preserve">arrival + 15 min</w:t>
+            </w:r>
+            <w:r>
+              <w:t xml:space="preserve"> if an appointment of the same service (booked or checked in) is due within the next 15 min, so that appointment goes first</w:t>
             </w:r>
           </w:p>
         </w:tc>
@@ -678,7 +738,7 @@
           </w:tcPr>
           <w:p>
             <w:r>
-              <w:t xml:space="preserve">Arrival time: joins as a walk-in, keeps its A-token, flagged "Late, now walk-in"</w:t>
+              <w:t xml:space="preserve">As a walk-in (above): keeps its A-token, flagged "Late, now walk-in"</w:t>
             </w:r>
           </w:p>
         </w:tc>
@@ -701,7 +761,7 @@
         <w:t xml:space="preserve">Call next</w:t>
       </w:r>
       <w:r>
-        <w:t xml:space="preserve"> (per counter):</w:t>
+        <w:t xml:space="preserve"> (per room, within its service queue):</w:t>
       </w:r>
     </w:p>
     <w:p>
@@ -714,7 +774,7 @@
         <w:spacing w:after="40"/>
       </w:pPr>
       <w:r>
-        <w:t xml:space="preserve">Nobody checked in → the counter stays free.</w:t>
+        <w:t xml:space="preserve">Nobody waiting for the service → the room stays free.</w:t>
       </w:r>
     </w:p>
     <w:p>
@@ -727,17 +787,14 @@
         <w:spacing w:after="40"/>
       </w:pPr>
       <w:r>
-        <w:t xml:space="preserve">Someone is </w:t>
-      </w:r>
-      <w:r>
-        <w:rPr>
-          <w:b/>
-          <w:bCs/>
-        </w:rPr>
-        <w:t xml:space="preserve">due</w:t>
-      </w:r>
-      <w:r>
-        <w:t xml:space="preserve"> (target ≤ now) → call the earliest target.</w:t>
+        <w:rPr>
+          <w:b/>
+          <w:bCs/>
+        </w:rPr>
+        <w:t xml:space="preserve">Priority</w:t>
+      </w:r>
+      <w:r>
+        <w:t xml:space="preserve"> patients first, earliest flagged first.</w:t>
       </w:r>
     </w:p>
     <w:p>
@@ -750,17 +807,24 @@
         <w:spacing w:after="40"/>
       </w:pPr>
       <w:r>
-        <w:t xml:space="preserve">Nobody due → call the earliest </w:t>
-      </w:r>
-      <w:r>
-        <w:rPr>
-          <w:b/>
-          <w:bCs/>
-        </w:rPr>
-        <w:t xml:space="preserve">upcoming</w:t>
-      </w:r>
-      <w:r>
-        <w:t xml:space="preserve"> target so the counter isn't idle. This is the only way an early appointment is seen early.</w:t>
+        <w:rPr>
+          <w:b/>
+          <w:bCs/>
+        </w:rPr>
+        <w:t xml:space="preserve">Due appointments</w:t>
+      </w:r>
+      <w:r>
+        <w:t xml:space="preserve"> and </w:t>
+      </w:r>
+      <w:r>
+        <w:rPr>
+          <w:b/>
+          <w:bCs/>
+        </w:rPr>
+        <w:t xml:space="preserve">protected walk-ins</w:t>
+      </w:r>
+      <w:r>
+        <w:t xml:space="preserve"> (waited 30+ min), by target time.</w:t>
       </w:r>
     </w:p>
     <w:p>
@@ -773,7 +837,40 @@
         <w:spacing w:after="40"/>
       </w:pPr>
       <w:r>
-        <w:t xml:space="preserve">Ties → appointment first, then the lower token number.</w:t>
+        <w:t xml:space="preserve">Other </w:t>
+      </w:r>
+      <w:r>
+        <w:rPr>
+          <w:b/>
+          <w:bCs/>
+        </w:rPr>
+        <w:t xml:space="preserve">due</w:t>
+      </w:r>
+      <w:r>
+        <w:t xml:space="preserve"> walk-ins (target ≤ now), by target.</w:t>
+      </w:r>
+    </w:p>
+    <w:p>
+      <w:pPr>
+        <w:pStyle w:val="ListParagraph"/>
+        <w:numPr>
+          <w:ilvl w:val="0"/>
+          <w:numId w:val="3"/>
+        </w:numPr>
+        <w:spacing w:after="40"/>
+      </w:pPr>
+      <w:r>
+        <w:t xml:space="preserve">Nobody due → the earliest </w:t>
+      </w:r>
+      <w:r>
+        <w:rPr>
+          <w:b/>
+          <w:bCs/>
+        </w:rPr>
+        <w:t xml:space="preserve">upcoming</w:t>
+      </w:r>
+      <w:r>
+        <w:t xml:space="preserve"> target, so the room isn't idle. Ties → appointment first, then the lower token.</w:t>
       </w:r>
     </w:p>
     <w:p>
@@ -823,7 +920,29 @@
         <w:t xml:space="preserve">Issued:</w:t>
       </w:r>
       <w:r>
-        <w:t xml:space="preserve"> a W-token when a walk-in is added; an A-token when an appointment is booked (it joins the queue only at check-in). Tokens never change, even when edited or late.</w:t>
+        <w:t xml:space="preserve"> </w:t>
+      </w:r>
+      <w:r>
+        <w:rPr>
+          <w:b/>
+          <w:bCs/>
+          <w:color w:val="7656A6"/>
+        </w:rPr>
+        <w:t xml:space="preserve">CW-…</w:t>
+      </w:r>
+      <w:r>
+        <w:t xml:space="preserve"> when a consultation walk-in is added; </w:t>
+      </w:r>
+      <w:r>
+        <w:rPr>
+          <w:b/>
+          <w:bCs/>
+          <w:color w:val="7656A6"/>
+        </w:rPr>
+        <w:t xml:space="preserve">CA-…</w:t>
+      </w:r>
+      <w:r>
+        <w:t xml:space="preserve"> when a consultation is booked (it joins the queue only at check-in). Tokens never change; a change of service means cancelling and adding again.</w:t>
       </w:r>
     </w:p>
     <w:p>
@@ -853,17 +972,7 @@
         <w:t xml:space="preserve">Print token</w:t>
       </w:r>
       <w:r>
-        <w:t xml:space="preserve"> prints an 80 mm slip with the token, booking, service, place, estimated wait, time issued and a QR code that opens the patient's place on the display, but no name. Waiting rows have </w:t>
-      </w:r>
-      <w:r>
-        <w:rPr>
-          <w:b/>
-          <w:bCs/>
-        </w:rPr>
-        <w:t xml:space="preserve">Print</w:t>
-      </w:r>
-      <w:r>
-        <w:t xml:space="preserve"> for reprints.</w:t>
+        <w:t xml:space="preserve"> prints an 80 mm slip with the token, service, room, booking, place, estimated wait, time issued and a QR code to the patient's place on the display, but no name.</w:t>
       </w:r>
     </w:p>
     <w:p>
@@ -883,7 +992,7 @@
         <w:t xml:space="preserve">Followed:</w:t>
       </w:r>
       <w:r>
-        <w:t xml:space="preserve"> the display shows Now serving, the next two under Please get ready, and every waiting token with initial, place and wait. </w:t>
+        <w:t xml:space="preserve"> the display has a panel per service with Now serving (token, initial, room) and the waiting tokens. </w:t>
       </w:r>
       <w:r>
         <w:rPr>
@@ -891,7 +1000,7 @@
           <w:bCs/>
           <w:color w:val="7656A6"/>
         </w:rPr>
-        <w:t xml:space="preserve">?token=W-004</w:t>
+        <w:t xml:space="preserve">?token=CW-004</w:t>
       </w:r>
       <w:r>
         <w:t xml:space="preserve"> or </w:t>
@@ -904,7 +1013,7 @@
         <w:t xml:space="preserve">Find my token</w:t>
       </w:r>
       <w:r>
-        <w:t xml:space="preserve"> highlights one row ("You are number 2 in line").</w:t>
+        <w:t xml:space="preserve"> highlights one ("You are number 2 in the General consultation queue").</w:t>
       </w:r>
     </w:p>
     <w:tbl>
@@ -945,7 +1054,7 @@
             <w:r>
               <w:drawing>
                 <wp:inline distT="0" distB="0" distL="0" distR="0">
-                  <wp:extent cx="2819400" cy="2743200"/>
+                  <wp:extent cx="2381250" cy="2314575"/>
                   <wp:effectExtent t="0" r="0" b="0" l="0"/>
                   <wp:docPr id="1" name=""/>
                   <wp:cNvGraphicFramePr>
@@ -970,7 +1079,7 @@
                         <pic:spPr bwMode="auto">
                           <a:xfrm>
                             <a:off x="0" y="0"/>
-                            <a:ext cx="2819400" cy="2743200"/>
+                            <a:ext cx="2381250" cy="2314575"/>
                           </a:xfrm>
                           <a:prstGeom prst="rect">
                             <a:avLst/>
@@ -1019,7 +1128,7 @@
             <w:r>
               <w:drawing>
                 <wp:inline distT="0" distB="0" distL="0" distR="0">
-                  <wp:extent cx="2819400" cy="2819400"/>
+                  <wp:extent cx="1809750" cy="2419350"/>
                   <wp:effectExtent t="0" r="0" b="0" l="0"/>
                   <wp:docPr id="2" name=""/>
                   <wp:cNvGraphicFramePr>
@@ -1044,7 +1153,7 @@
                         <pic:spPr bwMode="auto">
                           <a:xfrm>
                             <a:off x="0" y="0"/>
-                            <a:ext cx="2819400" cy="2819400"/>
+                            <a:ext cx="1809750" cy="2419350"/>
                           </a:xfrm>
                           <a:prstGeom prst="rect">
                             <a:avLst/>
@@ -1068,7 +1177,7 @@
                 <w:sz w:val="16"/>
                 <w:szCs w:val="16"/>
               </w:rPr>
-              <w:t xml:space="preserve">Figure 2. Call-next decision</w:t>
+              <w:t xml:space="preserve">Figure 2. Call-next decision (one room)</w:t>
             </w:r>
           </w:p>
         </w:tc>
@@ -1139,10 +1248,10 @@
                 <w:b/>
                 <w:bCs/>
               </w:rPr>
-              <w:t xml:space="preserve">2. Play the queue forward.</w:t>
-            </w:r>
-            <w:r>
-              <w:t xml:space="preserve"> The system works out when the counter will next be free: now if nobody is with the doctor, otherwise when the current patient should finish (at least 1 minute away). At that moment it "calls" the next patient using the same rule as the Call next button, notes their start time, adds their visit length, and repeats down the list.</w:t>
+              <w:t xml:space="preserve">2. Play each service queue forward.</w:t>
+            </w:r>
+            <w:r>
+              <w:t xml:space="preserve"> The system works out when the service's room will next be free: now if nobody is with the doctor, otherwise when the current patient should finish (at least 1 minute away). At that moment it "calls" the next patient using the same rule as the Call next button, notes their start time, adds their visit length, and repeats down that queue.</w:t>
             </w:r>
           </w:p>
           <w:p>
@@ -1157,17 +1266,17 @@
               <w:t xml:space="preserve">3. The wait.</w:t>
             </w:r>
             <w:r>
-              <w:t xml:space="preserve"> Wait = predicted start time − now. With one counter (as in the live demo) this is simply: </w:t>
+              <w:t xml:space="preserve"> Wait = predicted start time − now. With one room (the default) this is simply: </w:t>
             </w:r>
             <w:r>
               <w:rPr>
                 <w:b/>
                 <w:bCs/>
               </w:rPr>
-              <w:t xml:space="preserve">time left for the current patient + the visit lengths of everyone ahead.</w:t>
-            </w:r>
-            <w:r>
-              <w:t xml:space="preserve"> With more counters, each patient goes to whichever counter frees up first.</w:t>
+              <w:t xml:space="preserve">time left for the current patient + the visit lengths of everyone ahead in that queue.</w:t>
+            </w:r>
+            <w:r>
+              <w:t xml:space="preserve"> With more rooms, each patient goes to whichever room frees up first.</w:t>
             </w:r>
           </w:p>
           <w:p>
@@ -1205,7 +1314,7 @@
         <w:t xml:space="preserve">Worked example</w:t>
       </w:r>
       <w:r>
-        <w:t xml:space="preserve"> (also a unit test): 1 counter, now 10:00, the patient being served is expected to finish at 10:06, and no visit data yet.</w:t>
+        <w:t xml:space="preserve"> (also a unit test): the Consultation queue, 1 room, 15-min visits, now 10:00; the patient being seen is expected to finish at 10:06. CA-001 is booked for 10:05 and checked in at 09:55; CW-002 walked in at 09:50 and CW-003 at 09:58.</w:t>
       </w:r>
     </w:p>
     <w:tbl>
@@ -1221,12 +1330,12 @@
         </w:tblBorders>
       </w:tblPr>
       <w:tblGrid>
-        <w:gridCol w:w="2700"/>
-        <w:gridCol w:w="1000"/>
-        <w:gridCol w:w="2066"/>
-        <w:gridCol w:w="1500"/>
-        <w:gridCol w:w="1200"/>
-        <w:gridCol w:w="1400"/>
+        <w:gridCol w:w="2900"/>
+        <w:gridCol w:w="1900"/>
+        <w:gridCol w:w="1600"/>
+        <w:gridCol w:w="1100"/>
+        <w:gridCol w:w="1100"/>
+        <w:gridCol w:w="1266"/>
       </w:tblGrid>
       <w:tr>
         <w:trPr>
@@ -1234,7 +1343,7 @@
         </w:trPr>
         <w:tc>
           <w:tcPr>
-            <w:tcW w:type="dxa" w:w="2700"/>
+            <w:tcW w:type="dxa" w:w="2900"/>
             <w:tcBorders>
               <w:top w:val="single" w:color="E8E2F2" w:sz="4"/>
               <w:left w:val="none" w:color="FFFFFF" w:sz="0"/>
@@ -1262,7 +1371,7 @@
         </w:tc>
         <w:tc>
           <w:tcPr>
-            <w:tcW w:type="dxa" w:w="1000"/>
+            <w:tcW w:type="dxa" w:w="1900"/>
             <w:tcBorders>
               <w:top w:val="single" w:color="E8E2F2" w:sz="4"/>
               <w:left w:val="none" w:color="FFFFFF" w:sz="0"/>
@@ -1290,35 +1399,7 @@
         </w:tc>
         <w:tc>
           <w:tcPr>
-            <w:tcW w:type="dxa" w:w="2066"/>
-            <w:tcBorders>
-              <w:top w:val="single" w:color="E8E2F2" w:sz="4"/>
-              <w:left w:val="none" w:color="FFFFFF" w:sz="0"/>
-              <w:bottom w:val="single" w:color="E8E2F2" w:sz="4"/>
-              <w:right w:val="none" w:color="FFFFFF" w:sz="0"/>
-            </w:tcBorders>
-            <w:shd w:fill="F4F1FA" w:color="auto" w:val="clear"/>
-            <w:tcMar>
-              <w:top w:type="dxa" w:w="50"/>
-              <w:left w:type="dxa" w:w="90"/>
-              <w:bottom w:type="dxa" w:w="50"/>
-              <w:right w:type="dxa" w:w="90"/>
-            </w:tcMar>
-          </w:tcPr>
-          <w:p>
-            <w:r>
-              <w:rPr>
-                <w:b/>
-                <w:bCs/>
-                <w:color w:val="615A6E"/>
-              </w:rPr>
-              <w:t xml:space="preserve">Service</w:t>
-            </w:r>
-          </w:p>
-        </w:tc>
-        <w:tc>
-          <w:tcPr>
-            <w:tcW w:type="dxa" w:w="1500"/>
+            <w:tcW w:type="dxa" w:w="1600"/>
             <w:tcBorders>
               <w:top w:val="single" w:color="E8E2F2" w:sz="4"/>
               <w:left w:val="none" w:color="FFFFFF" w:sz="0"/>
@@ -1346,7 +1427,7 @@
         </w:tc>
         <w:tc>
           <w:tcPr>
-            <w:tcW w:type="dxa" w:w="1200"/>
+            <w:tcW w:type="dxa" w:w="1100"/>
             <w:tcBorders>
               <w:top w:val="single" w:color="E8E2F2" w:sz="4"/>
               <w:left w:val="none" w:color="FFFFFF" w:sz="0"/>
@@ -1374,7 +1455,7 @@
         </w:tc>
         <w:tc>
           <w:tcPr>
-            <w:tcW w:type="dxa" w:w="1400"/>
+            <w:tcW w:type="dxa" w:w="1100"/>
             <w:tcBorders>
               <w:top w:val="single" w:color="E8E2F2" w:sz="4"/>
               <w:left w:val="none" w:color="FFFFFF" w:sz="0"/>
@@ -1400,11 +1481,39 @@
             </w:r>
           </w:p>
         </w:tc>
+        <w:tc>
+          <w:tcPr>
+            <w:tcW w:type="dxa" w:w="1266"/>
+            <w:tcBorders>
+              <w:top w:val="single" w:color="E8E2F2" w:sz="4"/>
+              <w:left w:val="none" w:color="FFFFFF" w:sz="0"/>
+              <w:bottom w:val="single" w:color="E8E2F2" w:sz="4"/>
+              <w:right w:val="none" w:color="FFFFFF" w:sz="0"/>
+            </w:tcBorders>
+            <w:shd w:fill="F4F1FA" w:color="auto" w:val="clear"/>
+            <w:tcMar>
+              <w:top w:type="dxa" w:w="50"/>
+              <w:left w:type="dxa" w:w="90"/>
+              <w:bottom w:type="dxa" w:w="50"/>
+              <w:right w:type="dxa" w:w="90"/>
+            </w:tcMar>
+          </w:tcPr>
+          <w:p>
+            <w:r>
+              <w:rPr>
+                <w:b/>
+                <w:bCs/>
+                <w:color w:val="615A6E"/>
+              </w:rPr>
+              <w:t xml:space="preserve">Why</w:t>
+            </w:r>
+          </w:p>
+        </w:tc>
       </w:tr>
       <w:tr>
         <w:tc>
           <w:tcPr>
-            <w:tcW w:type="dxa" w:w="2700"/>
+            <w:tcW w:type="dxa" w:w="2900"/>
             <w:tcBorders>
               <w:top w:val="single" w:color="E8E2F2" w:sz="4"/>
               <w:left w:val="none" w:color="FFFFFF" w:sz="0"/>
@@ -1424,60 +1533,38 @@
                 <w:b/>
                 <w:bCs/>
               </w:rPr>
-              <w:t xml:space="preserve">W-001</w:t>
-            </w:r>
-            <w:r>
-              <w:t xml:space="preserve"> walk-in</w:t>
-            </w:r>
-          </w:p>
-        </w:tc>
-        <w:tc>
-          <w:tcPr>
-            <w:tcW w:type="dxa" w:w="1000"/>
-            <w:tcBorders>
-              <w:top w:val="single" w:color="E8E2F2" w:sz="4"/>
-              <w:left w:val="none" w:color="FFFFFF" w:sz="0"/>
-              <w:bottom w:val="single" w:color="E8E2F2" w:sz="4"/>
-              <w:right w:val="none" w:color="FFFFFF" w:sz="0"/>
-            </w:tcBorders>
-            <w:tcMar>
-              <w:top w:type="dxa" w:w="50"/>
-              <w:left w:type="dxa" w:w="90"/>
-              <w:bottom w:type="dxa" w:w="50"/>
-              <w:right w:type="dxa" w:w="90"/>
-            </w:tcMar>
-          </w:tcPr>
-          <w:p>
-            <w:r>
-              <w:t xml:space="preserve">09:50</w:t>
-            </w:r>
-          </w:p>
-        </w:tc>
-        <w:tc>
-          <w:tcPr>
-            <w:tcW w:type="dxa" w:w="2066"/>
-            <w:tcBorders>
-              <w:top w:val="single" w:color="E8E2F2" w:sz="4"/>
-              <w:left w:val="none" w:color="FFFFFF" w:sz="0"/>
-              <w:bottom w:val="single" w:color="E8E2F2" w:sz="4"/>
-              <w:right w:val="none" w:color="FFFFFF" w:sz="0"/>
-            </w:tcBorders>
-            <w:tcMar>
-              <w:top w:type="dxa" w:w="50"/>
-              <w:left w:type="dxa" w:w="90"/>
-              <w:bottom w:type="dxa" w:w="50"/>
-              <w:right w:type="dxa" w:w="90"/>
-            </w:tcMar>
-          </w:tcPr>
-          <w:p>
-            <w:r>
-              <w:t xml:space="preserve">Consultation (15)</w:t>
-            </w:r>
-          </w:p>
-        </w:tc>
-        <w:tc>
-          <w:tcPr>
-            <w:tcW w:type="dxa" w:w="1500"/>
+              <w:t xml:space="preserve">CA-001</w:t>
+            </w:r>
+            <w:r>
+              <w:t xml:space="preserve"> appointment</w:t>
+            </w:r>
+          </w:p>
+        </w:tc>
+        <w:tc>
+          <w:tcPr>
+            <w:tcW w:type="dxa" w:w="1900"/>
+            <w:tcBorders>
+              <w:top w:val="single" w:color="E8E2F2" w:sz="4"/>
+              <w:left w:val="none" w:color="FFFFFF" w:sz="0"/>
+              <w:bottom w:val="single" w:color="E8E2F2" w:sz="4"/>
+              <w:right w:val="none" w:color="FFFFFF" w:sz="0"/>
+            </w:tcBorders>
+            <w:tcMar>
+              <w:top w:type="dxa" w:w="50"/>
+              <w:left w:type="dxa" w:w="90"/>
+              <w:bottom w:type="dxa" w:w="50"/>
+              <w:right w:type="dxa" w:w="90"/>
+            </w:tcMar>
+          </w:tcPr>
+          <w:p>
+            <w:r>
+              <w:t xml:space="preserve">10:05 (booked)</w:t>
+            </w:r>
+          </w:p>
+        </w:tc>
+        <w:tc>
+          <w:tcPr>
+            <w:tcW w:type="dxa" w:w="1600"/>
             <w:tcBorders>
               <w:top w:val="single" w:color="E8E2F2" w:sz="4"/>
               <w:left w:val="none" w:color="FFFFFF" w:sz="0"/>
@@ -1499,7 +1586,7 @@
         </w:tc>
         <w:tc>
           <w:tcPr>
-            <w:tcW w:type="dxa" w:w="1200"/>
+            <w:tcW w:type="dxa" w:w="1100"/>
             <w:tcBorders>
               <w:top w:val="single" w:color="E8E2F2" w:sz="4"/>
               <w:left w:val="none" w:color="FFFFFF" w:sz="0"/>
@@ -1521,7 +1608,7 @@
         </w:tc>
         <w:tc>
           <w:tcPr>
-            <w:tcW w:type="dxa" w:w="1400"/>
+            <w:tcW w:type="dxa" w:w="1100"/>
             <w:tcBorders>
               <w:top w:val="single" w:color="E8E2F2" w:sz="4"/>
               <w:left w:val="none" w:color="FFFFFF" w:sz="0"/>
@@ -1538,6 +1625,28 @@
           <w:p>
             <w:r>
               <w:t xml:space="preserve">~10 min</w:t>
+            </w:r>
+          </w:p>
+        </w:tc>
+        <w:tc>
+          <w:tcPr>
+            <w:tcW w:type="dxa" w:w="1266"/>
+            <w:tcBorders>
+              <w:top w:val="single" w:color="E8E2F2" w:sz="4"/>
+              <w:left w:val="none" w:color="FFFFFF" w:sz="0"/>
+              <w:bottom w:val="single" w:color="E8E2F2" w:sz="4"/>
+              <w:right w:val="none" w:color="FFFFFF" w:sz="0"/>
+            </w:tcBorders>
+            <w:tcMar>
+              <w:top w:type="dxa" w:w="50"/>
+              <w:left w:type="dxa" w:w="90"/>
+              <w:bottom w:type="dxa" w:w="50"/>
+              <w:right w:type="dxa" w:w="90"/>
+            </w:tcMar>
+          </w:tcPr>
+          <w:p>
+            <w:r>
+              <w:t xml:space="preserve">due first</w:t>
             </w:r>
           </w:p>
         </w:tc>
@@ -1545,7 +1654,7 @@
       <w:tr>
         <w:tc>
           <w:tcPr>
-            <w:tcW w:type="dxa" w:w="2700"/>
+            <w:tcW w:type="dxa" w:w="2900"/>
             <w:tcBorders>
               <w:top w:val="single" w:color="E8E2F2" w:sz="4"/>
               <w:left w:val="none" w:color="FFFFFF" w:sz="0"/>
@@ -1565,60 +1674,38 @@
                 <w:b/>
                 <w:bCs/>
               </w:rPr>
-              <w:t xml:space="preserve">W-002</w:t>
-            </w:r>
-            <w:r>
-              <w:t xml:space="preserve"> walk-in</w:t>
-            </w:r>
-          </w:p>
-        </w:tc>
-        <w:tc>
-          <w:tcPr>
-            <w:tcW w:type="dxa" w:w="1000"/>
-            <w:tcBorders>
-              <w:top w:val="single" w:color="E8E2F2" w:sz="4"/>
-              <w:left w:val="none" w:color="FFFFFF" w:sz="0"/>
-              <w:bottom w:val="single" w:color="E8E2F2" w:sz="4"/>
-              <w:right w:val="none" w:color="FFFFFF" w:sz="0"/>
-            </w:tcBorders>
-            <w:tcMar>
-              <w:top w:type="dxa" w:w="50"/>
-              <w:left w:type="dxa" w:w="90"/>
-              <w:bottom w:type="dxa" w:w="50"/>
-              <w:right w:type="dxa" w:w="90"/>
-            </w:tcMar>
-          </w:tcPr>
-          <w:p>
-            <w:r>
-              <w:t xml:space="preserve">09:58</w:t>
-            </w:r>
-          </w:p>
-        </w:tc>
-        <w:tc>
-          <w:tcPr>
-            <w:tcW w:type="dxa" w:w="2066"/>
-            <w:tcBorders>
-              <w:top w:val="single" w:color="E8E2F2" w:sz="4"/>
-              <w:left w:val="none" w:color="FFFFFF" w:sz="0"/>
-              <w:bottom w:val="single" w:color="E8E2F2" w:sz="4"/>
-              <w:right w:val="none" w:color="FFFFFF" w:sz="0"/>
-            </w:tcBorders>
-            <w:tcMar>
-              <w:top w:type="dxa" w:w="50"/>
-              <w:left w:type="dxa" w:w="90"/>
-              <w:bottom w:type="dxa" w:w="50"/>
-              <w:right w:type="dxa" w:w="90"/>
-            </w:tcMar>
-          </w:tcPr>
-          <w:p>
-            <w:r>
-              <w:t xml:space="preserve">Vaccination (5)</w:t>
-            </w:r>
-          </w:p>
-        </w:tc>
-        <w:tc>
-          <w:tcPr>
-            <w:tcW w:type="dxa" w:w="1500"/>
+              <w:t xml:space="preserve">CW-002</w:t>
+            </w:r>
+            <w:r>
+              <w:t xml:space="preserve"> walk-in, 09:50</w:t>
+            </w:r>
+          </w:p>
+        </w:tc>
+        <w:tc>
+          <w:tcPr>
+            <w:tcW w:type="dxa" w:w="1900"/>
+            <w:tcBorders>
+              <w:top w:val="single" w:color="E8E2F2" w:sz="4"/>
+              <w:left w:val="none" w:color="FFFFFF" w:sz="0"/>
+              <w:bottom w:val="single" w:color="E8E2F2" w:sz="4"/>
+              <w:right w:val="none" w:color="FFFFFF" w:sz="0"/>
+            </w:tcBorders>
+            <w:tcMar>
+              <w:top w:type="dxa" w:w="50"/>
+              <w:left w:type="dxa" w:w="90"/>
+              <w:bottom w:type="dxa" w:w="50"/>
+              <w:right w:type="dxa" w:w="90"/>
+            </w:tcMar>
+          </w:tcPr>
+          <w:p>
+            <w:r>
+              <w:t xml:space="preserve">10:05 (held 15 min)</w:t>
+            </w:r>
+          </w:p>
+        </w:tc>
+        <w:tc>
+          <w:tcPr>
+            <w:tcW w:type="dxa" w:w="1600"/>
             <w:tcBorders>
               <w:top w:val="single" w:color="E8E2F2" w:sz="4"/>
               <w:left w:val="none" w:color="FFFFFF" w:sz="0"/>
@@ -1640,7 +1727,7 @@
         </w:tc>
         <w:tc>
           <w:tcPr>
-            <w:tcW w:type="dxa" w:w="1200"/>
+            <w:tcW w:type="dxa" w:w="1100"/>
             <w:tcBorders>
               <w:top w:val="single" w:color="E8E2F2" w:sz="4"/>
               <w:left w:val="none" w:color="FFFFFF" w:sz="0"/>
@@ -1662,7 +1749,7 @@
         </w:tc>
         <w:tc>
           <w:tcPr>
-            <w:tcW w:type="dxa" w:w="1400"/>
+            <w:tcW w:type="dxa" w:w="1100"/>
             <w:tcBorders>
               <w:top w:val="single" w:color="E8E2F2" w:sz="4"/>
               <w:left w:val="none" w:color="FFFFFF" w:sz="0"/>
@@ -1679,6 +1766,28 @@
           <w:p>
             <w:r>
               <w:t xml:space="preserve">~25 min</w:t>
+            </w:r>
+          </w:p>
+        </w:tc>
+        <w:tc>
+          <w:tcPr>
+            <w:tcW w:type="dxa" w:w="1266"/>
+            <w:tcBorders>
+              <w:top w:val="single" w:color="E8E2F2" w:sz="4"/>
+              <w:left w:val="none" w:color="FFFFFF" w:sz="0"/>
+              <w:bottom w:val="single" w:color="E8E2F2" w:sz="4"/>
+              <w:right w:val="none" w:color="FFFFFF" w:sz="0"/>
+            </w:tcBorders>
+            <w:tcMar>
+              <w:top w:type="dxa" w:w="50"/>
+              <w:left w:type="dxa" w:w="90"/>
+              <w:bottom w:type="dxa" w:w="50"/>
+              <w:right w:type="dxa" w:w="90"/>
+            </w:tcMar>
+          </w:tcPr>
+          <w:p>
+            <w:r>
+              <w:t xml:space="preserve">protected by 10:21</w:t>
             </w:r>
           </w:p>
         </w:tc>
@@ -1686,7 +1795,7 @@
       <w:tr>
         <w:tc>
           <w:tcPr>
-            <w:tcW w:type="dxa" w:w="2700"/>
+            <w:tcW w:type="dxa" w:w="2900"/>
             <w:tcBorders>
               <w:top w:val="single" w:color="E8E2F2" w:sz="4"/>
               <w:left w:val="none" w:color="FFFFFF" w:sz="0"/>
@@ -1706,120 +1815,120 @@
                 <w:b/>
                 <w:bCs/>
               </w:rPr>
-              <w:t xml:space="preserve">A-001</w:t>
-            </w:r>
-            <w:r>
-              <w:t xml:space="preserve"> appointment, early</w:t>
-            </w:r>
-          </w:p>
-        </w:tc>
-        <w:tc>
-          <w:tcPr>
-            <w:tcW w:type="dxa" w:w="1000"/>
-            <w:tcBorders>
-              <w:top w:val="single" w:color="E8E2F2" w:sz="4"/>
-              <w:left w:val="none" w:color="FFFFFF" w:sz="0"/>
-              <w:bottom w:val="single" w:color="E8E2F2" w:sz="4"/>
-              <w:right w:val="none" w:color="FFFFFF" w:sz="0"/>
-            </w:tcBorders>
-            <w:tcMar>
-              <w:top w:type="dxa" w:w="50"/>
-              <w:left w:type="dxa" w:w="90"/>
-              <w:bottom w:type="dxa" w:w="50"/>
-              <w:right w:type="dxa" w:w="90"/>
-            </w:tcMar>
-          </w:tcPr>
-          <w:p>
-            <w:r>
-              <w:t xml:space="preserve">10:05</w:t>
-            </w:r>
-          </w:p>
-        </w:tc>
-        <w:tc>
-          <w:tcPr>
-            <w:tcW w:type="dxa" w:w="2066"/>
-            <w:tcBorders>
-              <w:top w:val="single" w:color="E8E2F2" w:sz="4"/>
-              <w:left w:val="none" w:color="FFFFFF" w:sz="0"/>
-              <w:bottom w:val="single" w:color="E8E2F2" w:sz="4"/>
-              <w:right w:val="none" w:color="FFFFFF" w:sz="0"/>
-            </w:tcBorders>
-            <w:tcMar>
-              <w:top w:type="dxa" w:w="50"/>
-              <w:left w:type="dxa" w:w="90"/>
-              <w:bottom w:type="dxa" w:w="50"/>
-              <w:right w:type="dxa" w:w="90"/>
-            </w:tcMar>
-          </w:tcPr>
-          <w:p>
-            <w:r>
-              <w:t xml:space="preserve">Follow-up (10)</w:t>
-            </w:r>
-          </w:p>
-        </w:tc>
-        <w:tc>
-          <w:tcPr>
-            <w:tcW w:type="dxa" w:w="1500"/>
-            <w:tcBorders>
-              <w:top w:val="single" w:color="E8E2F2" w:sz="4"/>
-              <w:left w:val="none" w:color="FFFFFF" w:sz="0"/>
-              <w:bottom w:val="single" w:color="E8E2F2" w:sz="4"/>
-              <w:right w:val="none" w:color="FFFFFF" w:sz="0"/>
-            </w:tcBorders>
-            <w:tcMar>
-              <w:top w:type="dxa" w:w="50"/>
-              <w:left w:type="dxa" w:w="90"/>
-              <w:bottom w:type="dxa" w:w="50"/>
-              <w:right w:type="dxa" w:w="90"/>
-            </w:tcMar>
-          </w:tcPr>
-          <w:p>
-            <w:r>
-              <w:t xml:space="preserve">10:26</w:t>
-            </w:r>
-          </w:p>
-        </w:tc>
-        <w:tc>
-          <w:tcPr>
-            <w:tcW w:type="dxa" w:w="1200"/>
-            <w:tcBorders>
-              <w:top w:val="single" w:color="E8E2F2" w:sz="4"/>
-              <w:left w:val="none" w:color="FFFFFF" w:sz="0"/>
-              <w:bottom w:val="single" w:color="E8E2F2" w:sz="4"/>
-              <w:right w:val="none" w:color="FFFFFF" w:sz="0"/>
-            </w:tcBorders>
-            <w:tcMar>
-              <w:top w:type="dxa" w:w="50"/>
-              <w:left w:type="dxa" w:w="90"/>
-              <w:bottom w:type="dxa" w:w="50"/>
-              <w:right w:type="dxa" w:w="90"/>
-            </w:tcMar>
-          </w:tcPr>
-          <w:p>
-            <w:r>
-              <w:t xml:space="preserve">26 min</w:t>
-            </w:r>
-          </w:p>
-        </w:tc>
-        <w:tc>
-          <w:tcPr>
-            <w:tcW w:type="dxa" w:w="1400"/>
-            <w:tcBorders>
-              <w:top w:val="single" w:color="E8E2F2" w:sz="4"/>
-              <w:left w:val="none" w:color="FFFFFF" w:sz="0"/>
-              <w:bottom w:val="single" w:color="E8E2F2" w:sz="4"/>
-              <w:right w:val="none" w:color="FFFFFF" w:sz="0"/>
-            </w:tcBorders>
-            <w:tcMar>
-              <w:top w:type="dxa" w:w="50"/>
-              <w:left w:type="dxa" w:w="90"/>
-              <w:bottom w:type="dxa" w:w="50"/>
-              <w:right w:type="dxa" w:w="90"/>
-            </w:tcMar>
-          </w:tcPr>
-          <w:p>
-            <w:r>
-              <w:t xml:space="preserve">~30 min</w:t>
+              <w:t xml:space="preserve">CW-003</w:t>
+            </w:r>
+            <w:r>
+              <w:t xml:space="preserve"> walk-in, 09:58</w:t>
+            </w:r>
+          </w:p>
+        </w:tc>
+        <w:tc>
+          <w:tcPr>
+            <w:tcW w:type="dxa" w:w="1900"/>
+            <w:tcBorders>
+              <w:top w:val="single" w:color="E8E2F2" w:sz="4"/>
+              <w:left w:val="none" w:color="FFFFFF" w:sz="0"/>
+              <w:bottom w:val="single" w:color="E8E2F2" w:sz="4"/>
+              <w:right w:val="none" w:color="FFFFFF" w:sz="0"/>
+            </w:tcBorders>
+            <w:tcMar>
+              <w:top w:type="dxa" w:w="50"/>
+              <w:left w:type="dxa" w:w="90"/>
+              <w:bottom w:type="dxa" w:w="50"/>
+              <w:right w:type="dxa" w:w="90"/>
+            </w:tcMar>
+          </w:tcPr>
+          <w:p>
+            <w:r>
+              <w:t xml:space="preserve">10:13 (held 15 min)</w:t>
+            </w:r>
+          </w:p>
+        </w:tc>
+        <w:tc>
+          <w:tcPr>
+            <w:tcW w:type="dxa" w:w="1600"/>
+            <w:tcBorders>
+              <w:top w:val="single" w:color="E8E2F2" w:sz="4"/>
+              <w:left w:val="none" w:color="FFFFFF" w:sz="0"/>
+              <w:bottom w:val="single" w:color="E8E2F2" w:sz="4"/>
+              <w:right w:val="none" w:color="FFFFFF" w:sz="0"/>
+            </w:tcBorders>
+            <w:tcMar>
+              <w:top w:type="dxa" w:w="50"/>
+              <w:left w:type="dxa" w:w="90"/>
+              <w:bottom w:type="dxa" w:w="50"/>
+              <w:right w:type="dxa" w:w="90"/>
+            </w:tcMar>
+          </w:tcPr>
+          <w:p>
+            <w:r>
+              <w:t xml:space="preserve">10:36</w:t>
+            </w:r>
+          </w:p>
+        </w:tc>
+        <w:tc>
+          <w:tcPr>
+            <w:tcW w:type="dxa" w:w="1100"/>
+            <w:tcBorders>
+              <w:top w:val="single" w:color="E8E2F2" w:sz="4"/>
+              <w:left w:val="none" w:color="FFFFFF" w:sz="0"/>
+              <w:bottom w:val="single" w:color="E8E2F2" w:sz="4"/>
+              <w:right w:val="none" w:color="FFFFFF" w:sz="0"/>
+            </w:tcBorders>
+            <w:tcMar>
+              <w:top w:type="dxa" w:w="50"/>
+              <w:left w:type="dxa" w:w="90"/>
+              <w:bottom w:type="dxa" w:w="50"/>
+              <w:right w:type="dxa" w:w="90"/>
+            </w:tcMar>
+          </w:tcPr>
+          <w:p>
+            <w:r>
+              <w:t xml:space="preserve">36 min</w:t>
+            </w:r>
+          </w:p>
+        </w:tc>
+        <w:tc>
+          <w:tcPr>
+            <w:tcW w:type="dxa" w:w="1100"/>
+            <w:tcBorders>
+              <w:top w:val="single" w:color="E8E2F2" w:sz="4"/>
+              <w:left w:val="none" w:color="FFFFFF" w:sz="0"/>
+              <w:bottom w:val="single" w:color="E8E2F2" w:sz="4"/>
+              <w:right w:val="none" w:color="FFFFFF" w:sz="0"/>
+            </w:tcBorders>
+            <w:tcMar>
+              <w:top w:type="dxa" w:w="50"/>
+              <w:left w:type="dxa" w:w="90"/>
+              <w:bottom w:type="dxa" w:w="50"/>
+              <w:right w:type="dxa" w:w="90"/>
+            </w:tcMar>
+          </w:tcPr>
+          <w:p>
+            <w:r>
+              <w:t xml:space="preserve">~40 min</w:t>
+            </w:r>
+          </w:p>
+        </w:tc>
+        <w:tc>
+          <w:tcPr>
+            <w:tcW w:type="dxa" w:w="1266"/>
+            <w:tcBorders>
+              <w:top w:val="single" w:color="E8E2F2" w:sz="4"/>
+              <w:left w:val="none" w:color="FFFFFF" w:sz="0"/>
+              <w:bottom w:val="single" w:color="E8E2F2" w:sz="4"/>
+              <w:right w:val="none" w:color="FFFFFF" w:sz="0"/>
+            </w:tcBorders>
+            <w:tcMar>
+              <w:top w:type="dxa" w:w="50"/>
+              <w:left w:type="dxa" w:w="90"/>
+              <w:bottom w:type="dxa" w:w="50"/>
+              <w:right w:type="dxa" w:w="90"/>
+            </w:tcMar>
+          </w:tcPr>
+          <w:p>
+            <w:r>
+              <w:t xml:space="preserve">last target</w:t>
             </w:r>
           </w:p>
         </w:tc>
@@ -1830,7 +1939,7 @@
         <w:spacing w:after="80" w:before="80"/>
       </w:pPr>
       <w:r>
-        <w:t xml:space="preserve">A-001 doesn't overtake the two walk-ins, because they have earlier targets. Had W-002 arrived at 10:08 instead, A-001 (target 10:05) would be called first, at 10:21.</w:t>
+        <w:t xml:space="preserve">Both walk-ins arrived with CA-001 due within 15 minutes, so their targets are held and CA-001 is called first at 10:06. By 10:21 CW-002 has waited 31 minutes, so it is protected and goes before CW-003.</w:t>
       </w:r>
     </w:p>
     <w:p>
@@ -1851,7 +1960,7 @@
         <w:spacing w:after="40"/>
       </w:pPr>
       <w:r>
-        <w:t xml:space="preserve">When an appointment comes due, a walk-in who arrived after its slot may wait about one extra visit. In return, appointments are honoured and nobody is overtaken by a later target. Early appointments don't jump the queue; late ones lose their slot.</w:t>
+        <w:t xml:space="preserve">Appointments are honoured at their time, so a walk-in arriving just before one may wait about one extra visit; walk-in protection stops repeated pushing back. Late appointments lose their slot. Priority is a staff judgement, shown on the staff screen only.</w:t>
       </w:r>
     </w:p>
     <w:p>
@@ -1864,7 +1973,7 @@
         <w:spacing w:after="40"/>
       </w:pPr>
       <w:r>
-        <w:t xml:space="preserve">Idle-fill keeps counters busy, but can leave a counter occupied just as a later slot comes due. The estimate already includes this.</w:t>
+        <w:t xml:space="preserve">Idle-fill keeps rooms busy but can leave one occupied as a slot comes due; the estimate includes this. Waits are estimates that improve as real visit lengths accumulate. Screens poll every 3 seconds: simple on serverless, up to 3 s of lag.</w:t>
       </w:r>
     </w:p>
     <w:p>
@@ -1877,32 +1986,6 @@
         <w:spacing w:after="40"/>
       </w:pPr>
       <w:r>
-        <w:t xml:space="preserve">The overlap check counts every booking in the window, so with 2+ counters it can refuse a slot that would just fit. It's simple to explain to patients.</w:t>
-      </w:r>
-    </w:p>
-    <w:p>
-      <w:pPr>
-        <w:pStyle w:val="ListParagraph"/>
-        <w:numPr>
-          <w:ilvl w:val="0"/>
-          <w:numId w:val="2"/>
-        </w:numPr>
-        <w:spacing w:after="40"/>
-      </w:pPr>
-      <w:r>
-        <w:t xml:space="preserve">Waits are estimates, not promises: they converge as real visit lengths accumulate, and averaging softens one unusually long visit.</w:t>
-      </w:r>
-    </w:p>
-    <w:p>
-      <w:pPr>
-        <w:pStyle w:val="ListParagraph"/>
-        <w:numPr>
-          <w:ilvl w:val="0"/>
-          <w:numId w:val="2"/>
-        </w:numPr>
-        <w:spacing w:after="40"/>
-      </w:pPr>
-      <w:r>
         <w:rPr>
           <w:b/>
           <w:bCs/>
@@ -1910,7 +1993,7 @@
         <w:t xml:space="preserve">Limitations:</w:t>
       </w:r>
       <w:r>
-        <w:t xml:space="preserve"> one shared PIN rather than individual staff accounts (no record of who pressed a button); one queue per deployment; without Redis (local development) the queue lives in one server process's memory.</w:t>
+        <w:t xml:space="preserve"> one shared PIN rather than individual staff accounts (no record of who pressed a button); one clinic per deployment; a service can't be renamed once added; without Redis (local development) the queue lives in one server process's memory.</w:t>
       </w:r>
     </w:p>
     <w:p>
@@ -2915,7 +2998,7 @@
           </w:tcPr>
           <w:p>
             <w:r>
-              <w:t xml:space="preserve">Add a walk-in: name "Rina", service General consultation, </w:t>
+              <w:t xml:space="preserve">Add a walk-in: name "Rina", General consultation, </w:t>
             </w:r>
             <w:r>
               <w:rPr>
@@ -2947,7 +3030,7 @@
           </w:tcPr>
           <w:p>
             <w:r>
-              <w:t xml:space="preserve">Token W-001 with place 1 and Due now. The display shows W-001 R. within 3 seconds.</w:t>
+              <w:t xml:space="preserve">Token CW-001, place 1, Due now. The display's General consultation panel shows CW-001 R. within 3 seconds.</w:t>
             </w:r>
           </w:p>
         </w:tc>
@@ -3025,7 +3108,7 @@
           </w:tcPr>
           <w:p>
             <w:r>
-              <w:t xml:space="preserve">An 80 mm slip with W-001, Walk-in, the service, place, wait and a QR code, and no name. The QR opens the display with W-001 highlighted.</w:t>
+              <w:t xml:space="preserve">An 80 mm slip with CW-001, the service, Room 1, place, wait and a QR code, and no name. The QR opens the display with CW-001 highlighted.</w:t>
             </w:r>
           </w:p>
         </w:tc>
@@ -3071,92 +3154,92 @@
           </w:tcPr>
           <w:p>
             <w:r>
-              <w:t xml:space="preserve">Add a walk-in "Karim", service Vaccination.</w:t>
-            </w:r>
-          </w:p>
-        </w:tc>
-        <w:tc>
-          <w:tcPr>
-            <w:tcW w:type="dxa" w:w="4866"/>
-            <w:tcBorders>
-              <w:top w:val="single" w:color="E8E2F2" w:sz="4"/>
-              <w:left w:val="none" w:color="FFFFFF" w:sz="0"/>
-              <w:bottom w:val="single" w:color="E8E2F2" w:sz="4"/>
-              <w:right w:val="none" w:color="FFFFFF" w:sz="0"/>
-            </w:tcBorders>
-            <w:tcMar>
-              <w:top w:type="dxa" w:w="50"/>
-              <w:left w:type="dxa" w:w="90"/>
-              <w:bottom w:type="dxa" w:w="50"/>
-              <w:right w:type="dxa" w:w="90"/>
-            </w:tcMar>
-          </w:tcPr>
-          <w:p>
-            <w:r>
-              <w:t xml:space="preserve">W-002 at place 2, about 15 min (one consultation ahead).</w:t>
-            </w:r>
-          </w:p>
-        </w:tc>
-      </w:tr>
-      <w:tr>
-        <w:tc>
-          <w:tcPr>
-            <w:tcW w:type="dxa" w:w="500"/>
-            <w:tcBorders>
-              <w:top w:val="single" w:color="E8E2F2" w:sz="4"/>
-              <w:left w:val="none" w:color="FFFFFF" w:sz="0"/>
-              <w:bottom w:val="single" w:color="E8E2F2" w:sz="4"/>
-              <w:right w:val="none" w:color="FFFFFF" w:sz="0"/>
-            </w:tcBorders>
-            <w:tcMar>
-              <w:top w:type="dxa" w:w="50"/>
-              <w:left w:type="dxa" w:w="90"/>
-              <w:bottom w:type="dxa" w:w="50"/>
-              <w:right w:type="dxa" w:w="90"/>
-            </w:tcMar>
-          </w:tcPr>
-          <w:p>
-            <w:r>
-              <w:t xml:space="preserve">4</w:t>
-            </w:r>
-          </w:p>
-        </w:tc>
-        <w:tc>
-          <w:tcPr>
-            <w:tcW w:type="dxa" w:w="4500"/>
-            <w:tcBorders>
-              <w:top w:val="single" w:color="E8E2F2" w:sz="4"/>
-              <w:left w:val="none" w:color="FFFFFF" w:sz="0"/>
-              <w:bottom w:val="single" w:color="E8E2F2" w:sz="4"/>
-              <w:right w:val="none" w:color="FFFFFF" w:sz="0"/>
-            </w:tcBorders>
-            <w:tcMar>
-              <w:top w:type="dxa" w:w="50"/>
-              <w:left w:type="dxa" w:w="90"/>
-              <w:bottom w:type="dxa" w:w="50"/>
-              <w:right w:type="dxa" w:w="90"/>
-            </w:tcMar>
-          </w:tcPr>
-          <w:p>
-            <w:r>
-              <w:t xml:space="preserve">Choose </w:t>
+              <w:t xml:space="preserve">Add a walk-in "Karim", </w:t>
             </w:r>
             <w:r>
               <w:rPr>
                 <w:b/>
                 <w:bCs/>
               </w:rPr>
-              <w:t xml:space="preserve">Appointment</w:t>
-            </w:r>
-            <w:r>
-              <w:t xml:space="preserve">, name "Sadia", Follow-up, first free time, </w:t>
+              <w:t xml:space="preserve">Blood test</w:t>
+            </w:r>
+            <w:r>
+              <w:t xml:space="preserve">.</w:t>
+            </w:r>
+          </w:p>
+        </w:tc>
+        <w:tc>
+          <w:tcPr>
+            <w:tcW w:type="dxa" w:w="4866"/>
+            <w:tcBorders>
+              <w:top w:val="single" w:color="E8E2F2" w:sz="4"/>
+              <w:left w:val="none" w:color="FFFFFF" w:sz="0"/>
+              <w:bottom w:val="single" w:color="E8E2F2" w:sz="4"/>
+              <w:right w:val="none" w:color="FFFFFF" w:sz="0"/>
+            </w:tcBorders>
+            <w:tcMar>
+              <w:top w:type="dxa" w:w="50"/>
+              <w:left w:type="dxa" w:w="90"/>
+              <w:bottom w:type="dxa" w:w="50"/>
+              <w:right w:type="dxa" w:w="90"/>
+            </w:tcMar>
+          </w:tcPr>
+          <w:p>
+            <w:r>
+              <w:t xml:space="preserve">BW-001, place 1 in the Blood test queue: a separate queue with its own room.</w:t>
+            </w:r>
+          </w:p>
+        </w:tc>
+      </w:tr>
+      <w:tr>
+        <w:tc>
+          <w:tcPr>
+            <w:tcW w:type="dxa" w:w="500"/>
+            <w:tcBorders>
+              <w:top w:val="single" w:color="E8E2F2" w:sz="4"/>
+              <w:left w:val="none" w:color="FFFFFF" w:sz="0"/>
+              <w:bottom w:val="single" w:color="E8E2F2" w:sz="4"/>
+              <w:right w:val="none" w:color="FFFFFF" w:sz="0"/>
+            </w:tcBorders>
+            <w:tcMar>
+              <w:top w:type="dxa" w:w="50"/>
+              <w:left w:type="dxa" w:w="90"/>
+              <w:bottom w:type="dxa" w:w="50"/>
+              <w:right w:type="dxa" w:w="90"/>
+            </w:tcMar>
+          </w:tcPr>
+          <w:p>
+            <w:r>
+              <w:t xml:space="preserve">4</w:t>
+            </w:r>
+          </w:p>
+        </w:tc>
+        <w:tc>
+          <w:tcPr>
+            <w:tcW w:type="dxa" w:w="4500"/>
+            <w:tcBorders>
+              <w:top w:val="single" w:color="E8E2F2" w:sz="4"/>
+              <w:left w:val="none" w:color="FFFFFF" w:sz="0"/>
+              <w:bottom w:val="single" w:color="E8E2F2" w:sz="4"/>
+              <w:right w:val="none" w:color="FFFFFF" w:sz="0"/>
+            </w:tcBorders>
+            <w:tcMar>
+              <w:top w:type="dxa" w:w="50"/>
+              <w:left w:type="dxa" w:w="90"/>
+              <w:bottom w:type="dxa" w:w="50"/>
+              <w:right w:type="dxa" w:w="90"/>
+            </w:tcMar>
+          </w:tcPr>
+          <w:p>
+            <w:r>
+              <w:t xml:space="preserve">Book "Sadia", General consultation, 30+ min ahead; then "Omar", Blood test, the </w:t>
             </w:r>
             <w:r>
               <w:rPr>
                 <w:b/>
                 <w:bCs/>
               </w:rPr>
-              <w:t xml:space="preserve">Book appointment</w:t>
+              <w:t xml:space="preserve">same time</w:t>
             </w:r>
             <w:r>
               <w:t xml:space="preserve">.</w:t>
@@ -3181,7 +3264,7 @@
           </w:tcPr>
           <w:p>
             <w:r>
-              <w:t xml:space="preserve">A-001 appears under Booked, not arrived, not in the queue or on the display.</w:t>
+              <w:t xml:space="preserve">CA-001 and BA-001 are both booked. A second consultation at that time is refused (full for General consultation).</w:t>
             </w:r>
           </w:p>
         </w:tc>
@@ -3227,7 +3310,7 @@
           </w:tcPr>
           <w:p>
             <w:r>
-              <w:t xml:space="preserve">Open Booked, not arrived and click </w:t>
+              <w:t xml:space="preserve">In </w:t>
             </w:r>
             <w:r>
               <w:rPr>
@@ -3237,17 +3320,17 @@
               <w:t xml:space="preserve">Check in</w:t>
             </w:r>
             <w:r>
-              <w:t xml:space="preserve"> for A-001, then </w:t>
+              <w:t xml:space="preserve">, click </w:t>
             </w:r>
             <w:r>
               <w:rPr>
                 <w:b/>
                 <w:bCs/>
               </w:rPr>
-              <w:t xml:space="preserve">Print token</w:t>
-            </w:r>
-            <w:r>
-              <w:t xml:space="preserve">.</w:t>
+              <w:t xml:space="preserve">Check in</w:t>
+            </w:r>
+            <w:r>
+              <w:t xml:space="preserve"> for CA-001.</w:t>
             </w:r>
           </w:p>
         </w:tc>
@@ -3269,7 +3352,7 @@
           </w:tcPr>
           <w:p>
             <w:r>
-              <w:t xml:space="preserve">A-001 joins Waiting with an "Appt" label, behind the two walk-ins (its booked time is later).</w:t>
+              <w:t xml:space="preserve">CA-001 joins Waiting with an "Appt" label, behind CW-001 (its time is later).</w:t>
             </w:r>
           </w:p>
         </w:tc>
@@ -3315,7 +3398,7 @@
           </w:tcPr>
           <w:p>
             <w:r>
-              <w:t xml:space="preserve">On Counter 1 click </w:t>
+              <w:t xml:space="preserve">On the General consultation pill click </w:t>
             </w:r>
             <w:r>
               <w:rPr>
@@ -3347,7 +3430,7 @@
           </w:tcPr>
           <w:p>
             <w:r>
-              <w:t xml:space="preserve">W-001 is called; the reason says "the earliest due target". The display shows W-001 under Now serving.</w:t>
+              <w:t xml:space="preserve">CW-001 is called; click the pill for the reason. The display shows it under Now serving.</w:t>
             </w:r>
           </w:p>
         </w:tc>
@@ -3403,7 +3486,7 @@
               <w:t xml:space="preserve">Served &amp; call next</w:t>
             </w:r>
             <w:r>
-              <w:t xml:space="preserve"> twice.</w:t>
+              <w:t xml:space="preserve">.</w:t>
             </w:r>
           </w:p>
         </w:tc>
@@ -3425,7 +3508,7 @@
           </w:tcPr>
           <w:p>
             <w:r>
-              <w:t xml:space="preserve">W-002 is called, then A-001 "called early: nobody is due yet".</w:t>
+              <w:t xml:space="preserve">CA-001 is "called early: nobody is due yet". Only Served remains while nobody else waits.</w:t>
             </w:r>
           </w:p>
         </w:tc>
@@ -3471,85 +3554,27 @@
           </w:tcPr>
           <w:p>
             <w:r>
-              <w:t xml:space="preserve">Look at the counter while A-001 is being served.</w:t>
-            </w:r>
-          </w:p>
-        </w:tc>
-        <w:tc>
-          <w:tcPr>
-            <w:tcW w:type="dxa" w:w="4866"/>
-            <w:tcBorders>
-              <w:top w:val="single" w:color="E8E2F2" w:sz="4"/>
-              <w:left w:val="none" w:color="FFFFFF" w:sz="0"/>
-              <w:bottom w:val="single" w:color="E8E2F2" w:sz="4"/>
-              <w:right w:val="none" w:color="FFFFFF" w:sz="0"/>
-            </w:tcBorders>
-            <w:tcMar>
-              <w:top w:type="dxa" w:w="50"/>
-              <w:left w:type="dxa" w:w="90"/>
-              <w:bottom w:type="dxa" w:w="50"/>
-              <w:right w:type="dxa" w:w="90"/>
-            </w:tcMar>
-          </w:tcPr>
-          <w:p>
-            <w:r>
-              <w:t xml:space="preserve">Only Served and No-show remain, because nobody else is waiting.</w:t>
-            </w:r>
-          </w:p>
-        </w:tc>
-      </w:tr>
-      <w:tr>
-        <w:tc>
-          <w:tcPr>
-            <w:tcW w:type="dxa" w:w="500"/>
-            <w:tcBorders>
-              <w:top w:val="single" w:color="E8E2F2" w:sz="4"/>
-              <w:left w:val="none" w:color="FFFFFF" w:sz="0"/>
-              <w:bottom w:val="single" w:color="E8E2F2" w:sz="4"/>
-              <w:right w:val="none" w:color="FFFFFF" w:sz="0"/>
-            </w:tcBorders>
-            <w:tcMar>
-              <w:top w:type="dxa" w:w="50"/>
-              <w:left w:type="dxa" w:w="90"/>
-              <w:bottom w:type="dxa" w:w="50"/>
-              <w:right w:type="dxa" w:w="90"/>
-            </w:tcMar>
-          </w:tcPr>
-          <w:p>
-            <w:r>
-              <w:t xml:space="preserve">9</w:t>
-            </w:r>
-          </w:p>
-        </w:tc>
-        <w:tc>
-          <w:tcPr>
-            <w:tcW w:type="dxa" w:w="4500"/>
-            <w:tcBorders>
-              <w:top w:val="single" w:color="E8E2F2" w:sz="4"/>
-              <w:left w:val="none" w:color="FFFFFF" w:sz="0"/>
-              <w:bottom w:val="single" w:color="E8E2F2" w:sz="4"/>
-              <w:right w:val="none" w:color="FFFFFF" w:sz="0"/>
-            </w:tcBorders>
-            <w:tcMar>
-              <w:top w:type="dxa" w:w="50"/>
-              <w:left w:type="dxa" w:w="90"/>
-              <w:bottom w:type="dxa" w:w="50"/>
-              <w:right w:type="dxa" w:w="90"/>
-            </w:tcMar>
-          </w:tcPr>
-          <w:p>
-            <w:r>
-              <w:t xml:space="preserve">Click </w:t>
+              <w:t xml:space="preserve">Add "Lina" and "Rafi" (consultation), set </w:t>
             </w:r>
             <w:r>
               <w:rPr>
                 <w:b/>
                 <w:bCs/>
               </w:rPr>
-              <w:t xml:space="preserve">No-show</w:t>
-            </w:r>
-            <w:r>
-              <w:t xml:space="preserve"> and confirm.</w:t>
+              <w:t xml:space="preserve">Priority → Elderly</w:t>
+            </w:r>
+            <w:r>
+              <w:t xml:space="preserve"> on Rafi, serve CA-001 and </w:t>
+            </w:r>
+            <w:r>
+              <w:rPr>
+                <w:b/>
+                <w:bCs/>
+              </w:rPr>
+              <w:t xml:space="preserve">Call next</w:t>
+            </w:r>
+            <w:r>
+              <w:t xml:space="preserve">.</w:t>
             </w:r>
           </w:p>
         </w:tc>
@@ -3571,7 +3596,7 @@
           </w:tcPr>
           <w:p>
             <w:r>
-              <w:t xml:space="preserve">The counter shows Free. Finished today lists 2 Served and 1 No-show.</w:t>
+              <w:t xml:space="preserve">Rafi is called first: "priority (Elderly)".</w:t>
             </w:r>
           </w:p>
         </w:tc>
@@ -3595,6 +3620,74 @@
           </w:tcPr>
           <w:p>
             <w:r>
+              <w:t xml:space="preserve">9</w:t>
+            </w:r>
+          </w:p>
+        </w:tc>
+        <w:tc>
+          <w:tcPr>
+            <w:tcW w:type="dxa" w:w="4500"/>
+            <w:tcBorders>
+              <w:top w:val="single" w:color="E8E2F2" w:sz="4"/>
+              <w:left w:val="none" w:color="FFFFFF" w:sz="0"/>
+              <w:bottom w:val="single" w:color="E8E2F2" w:sz="4"/>
+              <w:right w:val="none" w:color="FFFFFF" w:sz="0"/>
+            </w:tcBorders>
+            <w:tcMar>
+              <w:top w:type="dxa" w:w="50"/>
+              <w:left w:type="dxa" w:w="90"/>
+              <w:bottom w:type="dxa" w:w="50"/>
+              <w:right w:type="dxa" w:w="90"/>
+            </w:tcMar>
+          </w:tcPr>
+          <w:p>
+            <w:r>
+              <w:t xml:space="preserve">Book a consultation 10 min ahead and check it in, then add a consultation walk-in.</w:t>
+            </w:r>
+          </w:p>
+        </w:tc>
+        <w:tc>
+          <w:tcPr>
+            <w:tcW w:type="dxa" w:w="4866"/>
+            <w:tcBorders>
+              <w:top w:val="single" w:color="E8E2F2" w:sz="4"/>
+              <w:left w:val="none" w:color="FFFFFF" w:sz="0"/>
+              <w:bottom w:val="single" w:color="E8E2F2" w:sz="4"/>
+              <w:right w:val="none" w:color="FFFFFF" w:sz="0"/>
+            </w:tcBorders>
+            <w:tcMar>
+              <w:top w:type="dxa" w:w="50"/>
+              <w:left w:type="dxa" w:w="90"/>
+              <w:bottom w:type="dxa" w:w="50"/>
+              <w:right w:type="dxa" w:w="90"/>
+            </w:tcMar>
+          </w:tcPr>
+          <w:p>
+            <w:r>
+              <w:t xml:space="preserve">The walk-in shows "target … · after CA-00x": held 15 min so the appointment goes first.</w:t>
+            </w:r>
+          </w:p>
+        </w:tc>
+      </w:tr>
+      <w:tr>
+        <w:tc>
+          <w:tcPr>
+            <w:tcW w:type="dxa" w:w="500"/>
+            <w:tcBorders>
+              <w:top w:val="single" w:color="E8E2F2" w:sz="4"/>
+              <w:left w:val="none" w:color="FFFFFF" w:sz="0"/>
+              <w:bottom w:val="single" w:color="E8E2F2" w:sz="4"/>
+              <w:right w:val="none" w:color="FFFFFF" w:sz="0"/>
+            </w:tcBorders>
+            <w:tcMar>
+              <w:top w:type="dxa" w:w="50"/>
+              <w:left w:type="dxa" w:w="90"/>
+              <w:bottom w:type="dxa" w:w="50"/>
+              <w:right w:type="dxa" w:w="90"/>
+            </w:tcMar>
+          </w:tcPr>
+          <w:p>
+            <w:r>
               <w:t xml:space="preserve">10</w:t>
             </w:r>
           </w:p>
@@ -3617,7 +3710,7 @@
           </w:tcPr>
           <w:p>
             <w:r>
-              <w:t xml:space="preserve">Try to book two appointments at the same time with 1 counter.</w:t>
+              <w:t xml:space="preserve">Settings → Services and departments: add "Dental" (letter D).</w:t>
             </w:r>
           </w:p>
         </w:tc>
@@ -3639,7 +3732,7 @@
           </w:tcPr>
           <w:p>
             <w:r>
-              <w:t xml:space="preserve">The second is refused and the slot shows as (full).</w:t>
+              <w:t xml:space="preserve">Dental appears in Add patient, Rooms, the timeline and the display; a walk-in gets DW-001.</w:t>
             </w:r>
           </w:p>
         </w:tc>
@@ -3762,7 +3855,7 @@
         <w:t xml:space="preserve">npm test</w:t>
       </w:r>
       <w:r>
-        <w:t xml:space="preserve"> runs 34 unit tests of the queue rules, sign-in and seed data; </w:t>
+        <w:t xml:space="preserve"> runs 52 unit tests of the queue rules, sign-in and seed data; </w:t>
       </w:r>
       <w:r>
         <w:rPr>
@@ -3773,7 +3866,7 @@
         <w:t xml:space="preserve">npm run test:e2e</w:t>
       </w:r>
       <w:r>
-        <w:t xml:space="preserve"> runs the browser tests (staff flow, printing, double-booking, display sync, and PIN sign-in when E2E_STAFF_PIN is set).</w:t>
+        <w:t xml:space="preserve"> runs 7 browser tests (staff flow, separate queues and priority, printing, booking per service, adding a service, display sync), plus PIN sign-in when E2E_STAFF_PIN is set.</w:t>
       </w:r>
     </w:p>
     <w:sectPr>
@@ -4019,7 +4112,7 @@
     </w:rPrDefault>
     <w:pPrDefault>
       <w:pPr>
-        <w:spacing w:line="252"/>
+        <w:spacing w:line="240"/>
       </w:pPr>
     </w:pPrDefault>
   </w:docDefaults>

</xml_diff>

<commit_message>
Docs: live app at qms.zayanblehhhh.space
</commit_message>
<xml_diff>
--- a/docs/documentation.docx
+++ b/docs/documentation.docx
@@ -44,7 +44,7 @@
         <w:t xml:space="preserve">Live app:</w:t>
       </w:r>
       <w:r>
-        <w:t xml:space="preserve"> https://queue-management-system-jet-six.vercel.app (front desk </w:t>
+        <w:t xml:space="preserve"> https://qms.zayanblehhhh.space (front desk </w:t>
       </w:r>
       <w:r>
         <w:rPr>
@@ -2813,7 +2813,7 @@
         <w:spacing w:after="80"/>
       </w:pPr>
       <w:r>
-        <w:t xml:space="preserve">Open the front desk at https://queue-management-system-jet-six.vercel.app/staff and sign in with the demo PIN </w:t>
+        <w:t xml:space="preserve">Open the front desk at https://qms.zayanblehhhh.space/staff and sign in with the demo PIN </w:t>
       </w:r>
       <w:r>
         <w:rPr>
@@ -2824,7 +2824,7 @@
         <w:t xml:space="preserve">12345</w:t>
       </w:r>
       <w:r>
-        <w:t xml:space="preserve">. Open https://queue-management-system-jet-six.vercel.app/display in a second window, side by side. In Settings, click </w:t>
+        <w:t xml:space="preserve">. Open https://qms.zayanblehhhh.space/display in a second window, side by side. In Settings, click </w:t>
       </w:r>
       <w:r>
         <w:rPr>

</xml_diff>